<commit_message>
Arruma detalhamento da documentação
</commit_message>
<xml_diff>
--- a/3_Bimestre/DOCUMENTACÃO.docx
+++ b/3_Bimestre/DOCUMENTACÃO.docx
@@ -1554,12 +1554,6 @@
         <w:gridCol w:w="7470"/>
       </w:tblGrid>
       <w:tr>
-        <w:tblPrEx>
-          <w:tblCellMar>
-            <w:top w:w="0" w:type="dxa"/>
-            <w:bottom w:w="0" w:type="dxa"/>
-          </w:tblCellMar>
-        </w:tblPrEx>
         <w:trPr>
           <w:tblHeader/>
         </w:trPr>
@@ -1617,12 +1611,6 @@
         </w:tc>
       </w:tr>
       <w:tr>
-        <w:tblPrEx>
-          <w:tblCellMar>
-            <w:top w:w="0" w:type="dxa"/>
-            <w:bottom w:w="0" w:type="dxa"/>
-          </w:tblCellMar>
-        </w:tblPrEx>
         <w:tc>
           <w:tcPr>
             <w:tcW w:w="1600" w:type="dxa"/>
@@ -1673,12 +1661,6 @@
         </w:tc>
       </w:tr>
       <w:tr>
-        <w:tblPrEx>
-          <w:tblCellMar>
-            <w:top w:w="0" w:type="dxa"/>
-            <w:bottom w:w="0" w:type="dxa"/>
-          </w:tblCellMar>
-        </w:tblPrEx>
         <w:tc>
           <w:tcPr>
             <w:tcW w:w="1600" w:type="dxa"/>
@@ -1747,12 +1729,6 @@
         </w:tc>
       </w:tr>
       <w:tr>
-        <w:tblPrEx>
-          <w:tblCellMar>
-            <w:top w:w="0" w:type="dxa"/>
-            <w:bottom w:w="0" w:type="dxa"/>
-          </w:tblCellMar>
-        </w:tblPrEx>
         <w:tc>
           <w:tcPr>
             <w:tcW w:w="1600" w:type="dxa"/>
@@ -1803,12 +1779,6 @@
         </w:tc>
       </w:tr>
       <w:tr>
-        <w:tblPrEx>
-          <w:tblCellMar>
-            <w:top w:w="0" w:type="dxa"/>
-            <w:bottom w:w="0" w:type="dxa"/>
-          </w:tblCellMar>
-        </w:tblPrEx>
         <w:tc>
           <w:tcPr>
             <w:tcW w:w="1600" w:type="dxa"/>
@@ -1859,12 +1829,6 @@
         </w:tc>
       </w:tr>
       <w:tr>
-        <w:tblPrEx>
-          <w:tblCellMar>
-            <w:top w:w="0" w:type="dxa"/>
-            <w:bottom w:w="0" w:type="dxa"/>
-          </w:tblCellMar>
-        </w:tblPrEx>
         <w:tc>
           <w:tcPr>
             <w:tcW w:w="1600" w:type="dxa"/>
@@ -1915,12 +1879,6 @@
         </w:tc>
       </w:tr>
       <w:tr>
-        <w:tblPrEx>
-          <w:tblCellMar>
-            <w:top w:w="0" w:type="dxa"/>
-            <w:bottom w:w="0" w:type="dxa"/>
-          </w:tblCellMar>
-        </w:tblPrEx>
         <w:tc>
           <w:tcPr>
             <w:tcW w:w="1600" w:type="dxa"/>
@@ -1971,12 +1929,6 @@
         </w:tc>
       </w:tr>
       <w:tr>
-        <w:tblPrEx>
-          <w:tblCellMar>
-            <w:top w:w="0" w:type="dxa"/>
-            <w:bottom w:w="0" w:type="dxa"/>
-          </w:tblCellMar>
-        </w:tblPrEx>
         <w:tc>
           <w:tcPr>
             <w:tcW w:w="1600" w:type="dxa"/>
@@ -2027,12 +1979,6 @@
         </w:tc>
       </w:tr>
       <w:tr>
-        <w:tblPrEx>
-          <w:tblCellMar>
-            <w:top w:w="0" w:type="dxa"/>
-            <w:bottom w:w="0" w:type="dxa"/>
-          </w:tblCellMar>
-        </w:tblPrEx>
         <w:tc>
           <w:tcPr>
             <w:tcW w:w="1600" w:type="dxa"/>
@@ -3282,12 +3228,6 @@
         <w:gridCol w:w="5870"/>
       </w:tblGrid>
       <w:tr>
-        <w:tblPrEx>
-          <w:tblCellMar>
-            <w:top w:w="0" w:type="dxa"/>
-            <w:bottom w:w="0" w:type="dxa"/>
-          </w:tblCellMar>
-        </w:tblPrEx>
         <w:trPr>
           <w:tblHeader/>
         </w:trPr>
@@ -3345,12 +3285,6 @@
         </w:tc>
       </w:tr>
       <w:tr>
-        <w:tblPrEx>
-          <w:tblCellMar>
-            <w:top w:w="0" w:type="dxa"/>
-            <w:bottom w:w="0" w:type="dxa"/>
-          </w:tblCellMar>
-        </w:tblPrEx>
         <w:tc>
           <w:tcPr>
             <w:tcW w:w="3200" w:type="dxa"/>
@@ -3403,12 +3337,6 @@
         </w:tc>
       </w:tr>
       <w:tr>
-        <w:tblPrEx>
-          <w:tblCellMar>
-            <w:top w:w="0" w:type="dxa"/>
-            <w:bottom w:w="0" w:type="dxa"/>
-          </w:tblCellMar>
-        </w:tblPrEx>
         <w:tc>
           <w:tcPr>
             <w:tcW w:w="3200" w:type="dxa"/>
@@ -3479,12 +3407,6 @@
         </w:tc>
       </w:tr>
       <w:tr>
-        <w:tblPrEx>
-          <w:tblCellMar>
-            <w:top w:w="0" w:type="dxa"/>
-            <w:bottom w:w="0" w:type="dxa"/>
-          </w:tblCellMar>
-        </w:tblPrEx>
         <w:tc>
           <w:tcPr>
             <w:tcW w:w="3200" w:type="dxa"/>
@@ -3555,12 +3477,6 @@
         </w:tc>
       </w:tr>
       <w:tr>
-        <w:tblPrEx>
-          <w:tblCellMar>
-            <w:top w:w="0" w:type="dxa"/>
-            <w:bottom w:w="0" w:type="dxa"/>
-          </w:tblCellMar>
-        </w:tblPrEx>
         <w:tc>
           <w:tcPr>
             <w:tcW w:w="3200" w:type="dxa"/>
@@ -3631,12 +3547,6 @@
         </w:tc>
       </w:tr>
       <w:tr>
-        <w:tblPrEx>
-          <w:tblCellMar>
-            <w:top w:w="0" w:type="dxa"/>
-            <w:bottom w:w="0" w:type="dxa"/>
-          </w:tblCellMar>
-        </w:tblPrEx>
         <w:tc>
           <w:tcPr>
             <w:tcW w:w="3200" w:type="dxa"/>
@@ -3687,12 +3597,6 @@
         </w:tc>
       </w:tr>
       <w:tr>
-        <w:tblPrEx>
-          <w:tblCellMar>
-            <w:top w:w="0" w:type="dxa"/>
-            <w:bottom w:w="0" w:type="dxa"/>
-          </w:tblCellMar>
-        </w:tblPrEx>
         <w:tc>
           <w:tcPr>
             <w:tcW w:w="3200" w:type="dxa"/>
@@ -3761,12 +3665,6 @@
         </w:tc>
       </w:tr>
       <w:tr>
-        <w:tblPrEx>
-          <w:tblCellMar>
-            <w:top w:w="0" w:type="dxa"/>
-            <w:bottom w:w="0" w:type="dxa"/>
-          </w:tblCellMar>
-        </w:tblPrEx>
         <w:tc>
           <w:tcPr>
             <w:tcW w:w="3200" w:type="dxa"/>
@@ -4359,12 +4257,6 @@
         <w:gridCol w:w="6070"/>
       </w:tblGrid>
       <w:tr>
-        <w:tblPrEx>
-          <w:tblCellMar>
-            <w:top w:w="0" w:type="dxa"/>
-            <w:bottom w:w="0" w:type="dxa"/>
-          </w:tblCellMar>
-        </w:tblPrEx>
         <w:trPr>
           <w:tblHeader/>
         </w:trPr>
@@ -4425,12 +4317,6 @@
         </w:tc>
       </w:tr>
       <w:tr>
-        <w:tblPrEx>
-          <w:tblCellMar>
-            <w:top w:w="0" w:type="dxa"/>
-            <w:bottom w:w="0" w:type="dxa"/>
-          </w:tblCellMar>
-        </w:tblPrEx>
         <w:tc>
           <w:tcPr>
             <w:tcW w:w="3000" w:type="dxa"/>
@@ -4499,12 +4385,6 @@
         </w:tc>
       </w:tr>
       <w:tr>
-        <w:tblPrEx>
-          <w:tblCellMar>
-            <w:top w:w="0" w:type="dxa"/>
-            <w:bottom w:w="0" w:type="dxa"/>
-          </w:tblCellMar>
-        </w:tblPrEx>
         <w:tc>
           <w:tcPr>
             <w:tcW w:w="3000" w:type="dxa"/>
@@ -4555,12 +4435,6 @@
         </w:tc>
       </w:tr>
       <w:tr>
-        <w:tblPrEx>
-          <w:tblCellMar>
-            <w:top w:w="0" w:type="dxa"/>
-            <w:bottom w:w="0" w:type="dxa"/>
-          </w:tblCellMar>
-        </w:tblPrEx>
         <w:tc>
           <w:tcPr>
             <w:tcW w:w="3000" w:type="dxa"/>
@@ -4611,12 +4485,6 @@
         </w:tc>
       </w:tr>
       <w:tr>
-        <w:tblPrEx>
-          <w:tblCellMar>
-            <w:top w:w="0" w:type="dxa"/>
-            <w:bottom w:w="0" w:type="dxa"/>
-          </w:tblCellMar>
-        </w:tblPrEx>
         <w:tc>
           <w:tcPr>
             <w:tcW w:w="3000" w:type="dxa"/>
@@ -5867,12 +5735,6 @@
         <w:gridCol w:w="6870"/>
       </w:tblGrid>
       <w:tr>
-        <w:tblPrEx>
-          <w:tblCellMar>
-            <w:top w:w="0" w:type="dxa"/>
-            <w:bottom w:w="0" w:type="dxa"/>
-          </w:tblCellMar>
-        </w:tblPrEx>
         <w:trPr>
           <w:tblHeader/>
         </w:trPr>
@@ -5933,12 +5795,6 @@
         </w:tc>
       </w:tr>
       <w:tr>
-        <w:tblPrEx>
-          <w:tblCellMar>
-            <w:top w:w="0" w:type="dxa"/>
-            <w:bottom w:w="0" w:type="dxa"/>
-          </w:tblCellMar>
-        </w:tblPrEx>
         <w:tc>
           <w:tcPr>
             <w:tcW w:w="2200" w:type="dxa"/>
@@ -5992,12 +5848,6 @@
         </w:tc>
       </w:tr>
       <w:tr>
-        <w:tblPrEx>
-          <w:tblCellMar>
-            <w:top w:w="0" w:type="dxa"/>
-            <w:bottom w:w="0" w:type="dxa"/>
-          </w:tblCellMar>
-        </w:tblPrEx>
         <w:tc>
           <w:tcPr>
             <w:tcW w:w="2200" w:type="dxa"/>
@@ -6066,12 +5916,6 @@
         </w:tc>
       </w:tr>
       <w:tr>
-        <w:tblPrEx>
-          <w:tblCellMar>
-            <w:top w:w="0" w:type="dxa"/>
-            <w:bottom w:w="0" w:type="dxa"/>
-          </w:tblCellMar>
-        </w:tblPrEx>
         <w:tc>
           <w:tcPr>
             <w:tcW w:w="2200" w:type="dxa"/>
@@ -6124,12 +5968,6 @@
         </w:tc>
       </w:tr>
       <w:tr>
-        <w:tblPrEx>
-          <w:tblCellMar>
-            <w:top w:w="0" w:type="dxa"/>
-            <w:bottom w:w="0" w:type="dxa"/>
-          </w:tblCellMar>
-        </w:tblPrEx>
         <w:tc>
           <w:tcPr>
             <w:tcW w:w="2200" w:type="dxa"/>
@@ -6200,12 +6038,6 @@
         </w:tc>
       </w:tr>
       <w:tr>
-        <w:tblPrEx>
-          <w:tblCellMar>
-            <w:top w:w="0" w:type="dxa"/>
-            <w:bottom w:w="0" w:type="dxa"/>
-          </w:tblCellMar>
-        </w:tblPrEx>
         <w:tc>
           <w:tcPr>
             <w:tcW w:w="2200" w:type="dxa"/>
@@ -6439,12 +6271,6 @@
         <w:gridCol w:w="7470"/>
       </w:tblGrid>
       <w:tr>
-        <w:tblPrEx>
-          <w:tblCellMar>
-            <w:top w:w="0" w:type="dxa"/>
-            <w:bottom w:w="0" w:type="dxa"/>
-          </w:tblCellMar>
-        </w:tblPrEx>
         <w:trPr>
           <w:tblHeader/>
         </w:trPr>
@@ -6502,12 +6328,6 @@
         </w:tc>
       </w:tr>
       <w:tr>
-        <w:tblPrEx>
-          <w:tblCellMar>
-            <w:top w:w="0" w:type="dxa"/>
-            <w:bottom w:w="0" w:type="dxa"/>
-          </w:tblCellMar>
-        </w:tblPrEx>
         <w:tc>
           <w:tcPr>
             <w:tcW w:w="1600" w:type="dxa"/>
@@ -6558,12 +6378,6 @@
         </w:tc>
       </w:tr>
       <w:tr>
-        <w:tblPrEx>
-          <w:tblCellMar>
-            <w:top w:w="0" w:type="dxa"/>
-            <w:bottom w:w="0" w:type="dxa"/>
-          </w:tblCellMar>
-        </w:tblPrEx>
         <w:tc>
           <w:tcPr>
             <w:tcW w:w="1600" w:type="dxa"/>
@@ -6615,12 +6429,6 @@
         </w:tc>
       </w:tr>
       <w:tr>
-        <w:tblPrEx>
-          <w:tblCellMar>
-            <w:top w:w="0" w:type="dxa"/>
-            <w:bottom w:w="0" w:type="dxa"/>
-          </w:tblCellMar>
-        </w:tblPrEx>
         <w:tc>
           <w:tcPr>
             <w:tcW w:w="1600" w:type="dxa"/>
@@ -6671,12 +6479,6 @@
         </w:tc>
       </w:tr>
       <w:tr>
-        <w:tblPrEx>
-          <w:tblCellMar>
-            <w:top w:w="0" w:type="dxa"/>
-            <w:bottom w:w="0" w:type="dxa"/>
-          </w:tblCellMar>
-        </w:tblPrEx>
         <w:tc>
           <w:tcPr>
             <w:tcW w:w="1600" w:type="dxa"/>
@@ -6727,12 +6529,6 @@
         </w:tc>
       </w:tr>
       <w:tr>
-        <w:tblPrEx>
-          <w:tblCellMar>
-            <w:top w:w="0" w:type="dxa"/>
-            <w:bottom w:w="0" w:type="dxa"/>
-          </w:tblCellMar>
-        </w:tblPrEx>
         <w:tc>
           <w:tcPr>
             <w:tcW w:w="1600" w:type="dxa"/>
@@ -6783,12 +6579,6 @@
         </w:tc>
       </w:tr>
       <w:tr>
-        <w:tblPrEx>
-          <w:tblCellMar>
-            <w:top w:w="0" w:type="dxa"/>
-            <w:bottom w:w="0" w:type="dxa"/>
-          </w:tblCellMar>
-        </w:tblPrEx>
         <w:tc>
           <w:tcPr>
             <w:tcW w:w="1600" w:type="dxa"/>
@@ -6913,12 +6703,6 @@
         <w:gridCol w:w="6870"/>
       </w:tblGrid>
       <w:tr>
-        <w:tblPrEx>
-          <w:tblCellMar>
-            <w:top w:w="0" w:type="dxa"/>
-            <w:bottom w:w="0" w:type="dxa"/>
-          </w:tblCellMar>
-        </w:tblPrEx>
         <w:trPr>
           <w:tblHeader/>
         </w:trPr>
@@ -6976,12 +6760,6 @@
         </w:tc>
       </w:tr>
       <w:tr>
-        <w:tblPrEx>
-          <w:tblCellMar>
-            <w:top w:w="0" w:type="dxa"/>
-            <w:bottom w:w="0" w:type="dxa"/>
-          </w:tblCellMar>
-        </w:tblPrEx>
         <w:tc>
           <w:tcPr>
             <w:tcW w:w="2200" w:type="dxa"/>
@@ -7032,12 +6810,6 @@
         </w:tc>
       </w:tr>
       <w:tr>
-        <w:tblPrEx>
-          <w:tblCellMar>
-            <w:top w:w="0" w:type="dxa"/>
-            <w:bottom w:w="0" w:type="dxa"/>
-          </w:tblCellMar>
-        </w:tblPrEx>
         <w:tc>
           <w:tcPr>
             <w:tcW w:w="2200" w:type="dxa"/>
@@ -7088,12 +6860,6 @@
         </w:tc>
       </w:tr>
       <w:tr>
-        <w:tblPrEx>
-          <w:tblCellMar>
-            <w:top w:w="0" w:type="dxa"/>
-            <w:bottom w:w="0" w:type="dxa"/>
-          </w:tblCellMar>
-        </w:tblPrEx>
         <w:tc>
           <w:tcPr>
             <w:tcW w:w="2200" w:type="dxa"/>
@@ -7144,12 +6910,6 @@
         </w:tc>
       </w:tr>
       <w:tr>
-        <w:tblPrEx>
-          <w:tblCellMar>
-            <w:top w:w="0" w:type="dxa"/>
-            <w:bottom w:w="0" w:type="dxa"/>
-          </w:tblCellMar>
-        </w:tblPrEx>
         <w:tc>
           <w:tcPr>
             <w:tcW w:w="2200" w:type="dxa"/>
@@ -7200,12 +6960,6 @@
         </w:tc>
       </w:tr>
       <w:tr>
-        <w:tblPrEx>
-          <w:tblCellMar>
-            <w:top w:w="0" w:type="dxa"/>
-            <w:bottom w:w="0" w:type="dxa"/>
-          </w:tblCellMar>
-        </w:tblPrEx>
         <w:tc>
           <w:tcPr>
             <w:tcW w:w="2200" w:type="dxa"/>
@@ -7256,12 +7010,6 @@
         </w:tc>
       </w:tr>
       <w:tr>
-        <w:tblPrEx>
-          <w:tblCellMar>
-            <w:top w:w="0" w:type="dxa"/>
-            <w:bottom w:w="0" w:type="dxa"/>
-          </w:tblCellMar>
-        </w:tblPrEx>
         <w:tc>
           <w:tcPr>
             <w:tcW w:w="2200" w:type="dxa"/>
@@ -7441,12 +7189,6 @@
         <w:gridCol w:w="6270"/>
       </w:tblGrid>
       <w:tr>
-        <w:tblPrEx>
-          <w:tblCellMar>
-            <w:top w:w="0" w:type="dxa"/>
-            <w:bottom w:w="0" w:type="dxa"/>
-          </w:tblCellMar>
-        </w:tblPrEx>
         <w:trPr>
           <w:tblHeader/>
         </w:trPr>
@@ -7510,12 +7252,6 @@
         </w:tc>
       </w:tr>
       <w:tr>
-        <w:tblPrEx>
-          <w:tblCellMar>
-            <w:top w:w="0" w:type="dxa"/>
-            <w:bottom w:w="0" w:type="dxa"/>
-          </w:tblCellMar>
-        </w:tblPrEx>
         <w:tc>
           <w:tcPr>
             <w:tcW w:w="2800" w:type="dxa"/>
@@ -7569,12 +7305,6 @@
         </w:tc>
       </w:tr>
       <w:tr>
-        <w:tblPrEx>
-          <w:tblCellMar>
-            <w:top w:w="0" w:type="dxa"/>
-            <w:bottom w:w="0" w:type="dxa"/>
-          </w:tblCellMar>
-        </w:tblPrEx>
         <w:tc>
           <w:tcPr>
             <w:tcW w:w="2800" w:type="dxa"/>
@@ -7625,12 +7355,6 @@
         </w:tc>
       </w:tr>
       <w:tr>
-        <w:tblPrEx>
-          <w:tblCellMar>
-            <w:top w:w="0" w:type="dxa"/>
-            <w:bottom w:w="0" w:type="dxa"/>
-          </w:tblCellMar>
-        </w:tblPrEx>
         <w:tc>
           <w:tcPr>
             <w:tcW w:w="2800" w:type="dxa"/>
@@ -7691,12 +7415,6 @@
         </w:tc>
       </w:tr>
       <w:tr>
-        <w:tblPrEx>
-          <w:tblCellMar>
-            <w:top w:w="0" w:type="dxa"/>
-            <w:bottom w:w="0" w:type="dxa"/>
-          </w:tblCellMar>
-        </w:tblPrEx>
         <w:tc>
           <w:tcPr>
             <w:tcW w:w="2800" w:type="dxa"/>
@@ -8071,6 +7789,87 @@
           <w:szCs w:val="24"/>
         </w:rPr>
         <w:t>/ do projeto.</w:t>
+      </w:r>
+      <w:r>
+        <w:rPr>
+          <w:noProof/>
+        </w:rPr>
+        <w:lastRenderedPageBreak/>
+        <w:drawing>
+          <wp:inline distT="0" distB="0" distL="0" distR="0" wp14:anchorId="5F44AC1D" wp14:editId="427BB7A3">
+            <wp:extent cx="5760085" cy="2809875"/>
+            <wp:effectExtent l="0" t="0" r="0" b="9525"/>
+            <wp:docPr id="1479125442" name="Imagem 1"/>
+            <wp:cNvGraphicFramePr>
+              <a:graphicFrameLocks xmlns:a="http://schemas.openxmlformats.org/drawingml/2006/main" noChangeAspect="1"/>
+            </wp:cNvGraphicFramePr>
+            <a:graphic xmlns:a="http://schemas.openxmlformats.org/drawingml/2006/main">
+              <a:graphicData uri="http://schemas.openxmlformats.org/drawingml/2006/picture">
+                <pic:pic xmlns:pic="http://schemas.openxmlformats.org/drawingml/2006/picture">
+                  <pic:nvPicPr>
+                    <pic:cNvPr id="1479125442" name="Imagem 1479125442"/>
+                    <pic:cNvPicPr/>
+                  </pic:nvPicPr>
+                  <pic:blipFill>
+                    <a:blip r:embed="rId5"/>
+                    <a:stretch>
+                      <a:fillRect/>
+                    </a:stretch>
+                  </pic:blipFill>
+                  <pic:spPr>
+                    <a:xfrm>
+                      <a:off x="0" y="0"/>
+                      <a:ext cx="5760085" cy="2809875"/>
+                    </a:xfrm>
+                    <a:prstGeom prst="rect">
+                      <a:avLst/>
+                    </a:prstGeom>
+                  </pic:spPr>
+                </pic:pic>
+              </a:graphicData>
+            </a:graphic>
+          </wp:inline>
+        </w:drawing>
+      </w:r>
+      <w:r>
+        <w:rPr>
+          <w:noProof/>
+        </w:rPr>
+        <w:drawing>
+          <wp:inline distT="0" distB="0" distL="0" distR="0" wp14:anchorId="3BD1DF89" wp14:editId="1F40B731">
+            <wp:extent cx="5760085" cy="3486150"/>
+            <wp:effectExtent l="0" t="0" r="0" b="0"/>
+            <wp:docPr id="1974584357" name="Imagem 2"/>
+            <wp:cNvGraphicFramePr>
+              <a:graphicFrameLocks xmlns:a="http://schemas.openxmlformats.org/drawingml/2006/main" noChangeAspect="1"/>
+            </wp:cNvGraphicFramePr>
+            <a:graphic xmlns:a="http://schemas.openxmlformats.org/drawingml/2006/main">
+              <a:graphicData uri="http://schemas.openxmlformats.org/drawingml/2006/picture">
+                <pic:pic xmlns:pic="http://schemas.openxmlformats.org/drawingml/2006/picture">
+                  <pic:nvPicPr>
+                    <pic:cNvPr id="1974584357" name="Imagem 1974584357"/>
+                    <pic:cNvPicPr/>
+                  </pic:nvPicPr>
+                  <pic:blipFill>
+                    <a:blip r:embed="rId6"/>
+                    <a:stretch>
+                      <a:fillRect/>
+                    </a:stretch>
+                  </pic:blipFill>
+                  <pic:spPr>
+                    <a:xfrm>
+                      <a:off x="0" y="0"/>
+                      <a:ext cx="5760085" cy="3486150"/>
+                    </a:xfrm>
+                    <a:prstGeom prst="rect">
+                      <a:avLst/>
+                    </a:prstGeom>
+                  </pic:spPr>
+                </pic:pic>
+              </a:graphicData>
+            </a:graphic>
+          </wp:inline>
+        </w:drawing>
       </w:r>
     </w:p>
     <w:p>
@@ -8154,6 +7953,7 @@
           <w:sz w:val="24"/>
           <w:szCs w:val="24"/>
         </w:rPr>
+        <w:lastRenderedPageBreak/>
         <w:t xml:space="preserve">Fazer login: o usuário acessa a plataforma e informa seu login e senha. A senha é verificada utilizando </w:t>
       </w:r>
       <w:proofErr w:type="spellStart"/>
@@ -8191,7 +7991,6 @@
           <w:sz w:val="24"/>
           <w:szCs w:val="24"/>
         </w:rPr>
-        <w:lastRenderedPageBreak/>
         <w:t>Cadastrar, editar e excluir produtos: o admin registra os produtos com SKU, nome, categoria, tamanho, cor, preço, estoque atual e estoque mínimo, podendo alterar ou excluir esses registros. Caso o produto já tenha sido utilizado em algum pedido, o sistema não permite a exclusão, preservando o histórico.</w:t>
       </w:r>
     </w:p>
@@ -8321,7 +8120,56 @@
           <w:sz w:val="24"/>
           <w:szCs w:val="24"/>
         </w:rPr>
-        <w:t>A diferença entre os dois atores está no nível de permissão: o admin possui acesso total às operações CRUD, enquanto o assistente pode consultar as informações e executar a análise de IA.</w:t>
+        <w:t xml:space="preserve">A diferença entre os dois atores está no nível de permissão: o admin possui acesso total às operações CRUD, enquanto o assistente pode consultar as </w:t>
+      </w:r>
+      <w:r>
+        <w:rPr>
+          <w:rFonts w:ascii="Arial" w:eastAsia="Arial" w:hAnsi="Arial" w:cs="Arial"/>
+          <w:sz w:val="24"/>
+          <w:szCs w:val="24"/>
+        </w:rPr>
+        <w:lastRenderedPageBreak/>
+        <w:t>informações e executar a análise de IA.</w:t>
+      </w:r>
+      <w:r>
+        <w:rPr>
+          <w:noProof/>
+        </w:rPr>
+        <w:drawing>
+          <wp:inline distT="0" distB="0" distL="0" distR="0" wp14:anchorId="53F030DA" wp14:editId="4648C7E8">
+            <wp:extent cx="5760085" cy="4140835"/>
+            <wp:effectExtent l="0" t="0" r="0" b="0"/>
+            <wp:docPr id="275729324" name="Imagem 5"/>
+            <wp:cNvGraphicFramePr>
+              <a:graphicFrameLocks xmlns:a="http://schemas.openxmlformats.org/drawingml/2006/main" noChangeAspect="1"/>
+            </wp:cNvGraphicFramePr>
+            <a:graphic xmlns:a="http://schemas.openxmlformats.org/drawingml/2006/main">
+              <a:graphicData uri="http://schemas.openxmlformats.org/drawingml/2006/picture">
+                <pic:pic xmlns:pic="http://schemas.openxmlformats.org/drawingml/2006/picture">
+                  <pic:nvPicPr>
+                    <pic:cNvPr id="275729324" name="Imagem 275729324"/>
+                    <pic:cNvPicPr/>
+                  </pic:nvPicPr>
+                  <pic:blipFill>
+                    <a:blip r:embed="rId7"/>
+                    <a:stretch>
+                      <a:fillRect/>
+                    </a:stretch>
+                  </pic:blipFill>
+                  <pic:spPr>
+                    <a:xfrm>
+                      <a:off x="0" y="0"/>
+                      <a:ext cx="5760085" cy="4140835"/>
+                    </a:xfrm>
+                    <a:prstGeom prst="rect">
+                      <a:avLst/>
+                    </a:prstGeom>
+                  </pic:spPr>
+                </pic:pic>
+              </a:graphicData>
+            </a:graphic>
+          </wp:inline>
+        </w:drawing>
       </w:r>
     </w:p>
     <w:p>
@@ -8353,7 +8201,7 @@
           <w:sz w:val="24"/>
           <w:szCs w:val="24"/>
         </w:rPr>
-        <w:t xml:space="preserve">O fluxograma foi utilizado para facilitar a compreensão do caminho percorrido pelo sistema e para enxergar com mais clareza onde podem acontecer erros. Ele mostra, por exemplo, o caminho do registro de um pedido, desde o preenchimento das informações até a baixa automática do estoque, e o caminho da execução de uma </w:t>
+        <w:t xml:space="preserve">O fluxograma foi utilizado para facilitar a compreensão do caminho percorrido pelo sistema e para enxergar com mais clareza onde podem acontecer erros. Ele mostra, por exemplo, o caminho do registro de um pedido, desde o preenchimento das informações até a baixa automática do estoque, e o caminho da execução de uma análise, desde o cálculo do resumo em Python até a exibição do resultado no painel </w:t>
       </w:r>
       <w:r>
         <w:rPr>
@@ -8362,7 +8210,47 @@
           <w:szCs w:val="24"/>
         </w:rPr>
         <w:lastRenderedPageBreak/>
-        <w:t>análise, desde o cálculo do resumo em Python até a exibição do resultado no painel de IA.</w:t>
+        <w:t>de IA.</w:t>
+      </w:r>
+      <w:r>
+        <w:rPr>
+          <w:noProof/>
+        </w:rPr>
+        <w:drawing>
+          <wp:inline distT="0" distB="0" distL="0" distR="0" wp14:anchorId="2CA0C2B1" wp14:editId="75A1C854">
+            <wp:extent cx="5760085" cy="7695565"/>
+            <wp:effectExtent l="0" t="0" r="0" b="635"/>
+            <wp:docPr id="1044865892" name="Imagem 4"/>
+            <wp:cNvGraphicFramePr>
+              <a:graphicFrameLocks xmlns:a="http://schemas.openxmlformats.org/drawingml/2006/main" noChangeAspect="1"/>
+            </wp:cNvGraphicFramePr>
+            <a:graphic xmlns:a="http://schemas.openxmlformats.org/drawingml/2006/main">
+              <a:graphicData uri="http://schemas.openxmlformats.org/drawingml/2006/picture">
+                <pic:pic xmlns:pic="http://schemas.openxmlformats.org/drawingml/2006/picture">
+                  <pic:nvPicPr>
+                    <pic:cNvPr id="1044865892" name="Imagem 1044865892"/>
+                    <pic:cNvPicPr/>
+                  </pic:nvPicPr>
+                  <pic:blipFill>
+                    <a:blip r:embed="rId8"/>
+                    <a:stretch>
+                      <a:fillRect/>
+                    </a:stretch>
+                  </pic:blipFill>
+                  <pic:spPr>
+                    <a:xfrm>
+                      <a:off x="0" y="0"/>
+                      <a:ext cx="5760085" cy="7695565"/>
+                    </a:xfrm>
+                    <a:prstGeom prst="rect">
+                      <a:avLst/>
+                    </a:prstGeom>
+                  </pic:spPr>
+                </pic:pic>
+              </a:graphicData>
+            </a:graphic>
+          </wp:inline>
+        </w:drawing>
       </w:r>
     </w:p>
     <w:p>
@@ -8394,6 +8282,7 @@
           <w:sz w:val="24"/>
           <w:szCs w:val="24"/>
         </w:rPr>
+        <w:lastRenderedPageBreak/>
         <w:t xml:space="preserve">O diagrama de sequência permite visualizar como as partes do sistema interagem entre si durante os processos. No caso da análise inteligente, a sequência envolve o navegador, que faz a solicitação; o </w:t>
       </w:r>
       <w:proofErr w:type="spellStart"/>
@@ -8449,6 +8338,46 @@
           <w:szCs w:val="24"/>
         </w:rPr>
         <w:t>, que salva o resultado no banco de dados e devolve as informações para a tela.</w:t>
+      </w:r>
+      <w:r>
+        <w:rPr>
+          <w:noProof/>
+        </w:rPr>
+        <w:drawing>
+          <wp:inline distT="0" distB="0" distL="0" distR="0" wp14:anchorId="4FCFFDEC" wp14:editId="726F694F">
+            <wp:extent cx="5760085" cy="3457575"/>
+            <wp:effectExtent l="0" t="0" r="0" b="9525"/>
+            <wp:docPr id="1230649726" name="Imagem 6"/>
+            <wp:cNvGraphicFramePr>
+              <a:graphicFrameLocks xmlns:a="http://schemas.openxmlformats.org/drawingml/2006/main" noChangeAspect="1"/>
+            </wp:cNvGraphicFramePr>
+            <a:graphic xmlns:a="http://schemas.openxmlformats.org/drawingml/2006/main">
+              <a:graphicData uri="http://schemas.openxmlformats.org/drawingml/2006/picture">
+                <pic:pic xmlns:pic="http://schemas.openxmlformats.org/drawingml/2006/picture">
+                  <pic:nvPicPr>
+                    <pic:cNvPr id="1230649726" name="Imagem 1230649726"/>
+                    <pic:cNvPicPr/>
+                  </pic:nvPicPr>
+                  <pic:blipFill>
+                    <a:blip r:embed="rId9"/>
+                    <a:stretch>
+                      <a:fillRect/>
+                    </a:stretch>
+                  </pic:blipFill>
+                  <pic:spPr>
+                    <a:xfrm>
+                      <a:off x="0" y="0"/>
+                      <a:ext cx="5760085" cy="3457575"/>
+                    </a:xfrm>
+                    <a:prstGeom prst="rect">
+                      <a:avLst/>
+                    </a:prstGeom>
+                  </pic:spPr>
+                </pic:pic>
+              </a:graphicData>
+            </a:graphic>
+          </wp:inline>
+        </w:drawing>
       </w:r>
     </w:p>
     <w:p>
@@ -8534,7 +8463,16 @@
           <w:sz w:val="24"/>
           <w:szCs w:val="24"/>
         </w:rPr>
-        <w:t xml:space="preserve">, com seus atributos e ligações, que no código correspondem aos modelos mapeados pelo </w:t>
+        <w:t xml:space="preserve">, com seus atributos e ligações, que no </w:t>
+      </w:r>
+      <w:r>
+        <w:rPr>
+          <w:rFonts w:ascii="Arial" w:eastAsia="Arial" w:hAnsi="Arial" w:cs="Arial"/>
+          <w:sz w:val="24"/>
+          <w:szCs w:val="24"/>
+        </w:rPr>
+        <w:lastRenderedPageBreak/>
+        <w:t xml:space="preserve">código correspondem aos modelos mapeados pelo </w:t>
       </w:r>
       <w:proofErr w:type="spellStart"/>
       <w:r>
@@ -8553,6 +8491,46 @@
           <w:szCs w:val="24"/>
         </w:rPr>
         <w:t>.</w:t>
+      </w:r>
+      <w:r>
+        <w:rPr>
+          <w:noProof/>
+        </w:rPr>
+        <w:drawing>
+          <wp:inline distT="0" distB="0" distL="0" distR="0" wp14:anchorId="74E35C21" wp14:editId="3D6B4612">
+            <wp:extent cx="5760085" cy="3119120"/>
+            <wp:effectExtent l="0" t="0" r="0" b="5080"/>
+            <wp:docPr id="1080393513" name="Imagem 7"/>
+            <wp:cNvGraphicFramePr>
+              <a:graphicFrameLocks xmlns:a="http://schemas.openxmlformats.org/drawingml/2006/main" noChangeAspect="1"/>
+            </wp:cNvGraphicFramePr>
+            <a:graphic xmlns:a="http://schemas.openxmlformats.org/drawingml/2006/main">
+              <a:graphicData uri="http://schemas.openxmlformats.org/drawingml/2006/picture">
+                <pic:pic xmlns:pic="http://schemas.openxmlformats.org/drawingml/2006/picture">
+                  <pic:nvPicPr>
+                    <pic:cNvPr id="1080393513" name="Imagem 1080393513"/>
+                    <pic:cNvPicPr/>
+                  </pic:nvPicPr>
+                  <pic:blipFill>
+                    <a:blip r:embed="rId10"/>
+                    <a:stretch>
+                      <a:fillRect/>
+                    </a:stretch>
+                  </pic:blipFill>
+                  <pic:spPr>
+                    <a:xfrm>
+                      <a:off x="0" y="0"/>
+                      <a:ext cx="5760085" cy="3119120"/>
+                    </a:xfrm>
+                    <a:prstGeom prst="rect">
+                      <a:avLst/>
+                    </a:prstGeom>
+                  </pic:spPr>
+                </pic:pic>
+              </a:graphicData>
+            </a:graphic>
+          </wp:inline>
+        </w:drawing>
       </w:r>
     </w:p>
     <w:p>
@@ -8714,16 +8692,7 @@
           <w:sz w:val="24"/>
           <w:szCs w:val="24"/>
         </w:rPr>
-        <w:t xml:space="preserve">Tela responsável pelo CRUD de produtos. Nela é possível cadastrar, editar e excluir produtos, informando SKU, nome, categoria, tamanho, cor, preço, estoque </w:t>
-      </w:r>
-      <w:r>
-        <w:rPr>
-          <w:rFonts w:ascii="Arial" w:eastAsia="Arial" w:hAnsi="Arial" w:cs="Arial"/>
-          <w:sz w:val="24"/>
-          <w:szCs w:val="24"/>
-        </w:rPr>
-        <w:lastRenderedPageBreak/>
-        <w:t>atual e estoque mínimo. A exclusão é bloqueada quando o produto já foi utilizado em algum pedido.</w:t>
+        <w:t>Tela responsável pelo CRUD de produtos. Nela é possível cadastrar, editar e excluir produtos, informando SKU, nome, categoria, tamanho, cor, preço, estoque atual e estoque mínimo. A exclusão é bloqueada quando o produto já foi utilizado em algum pedido.</w:t>
       </w:r>
     </w:p>
     <w:p>
@@ -8739,6 +8708,7 @@
           <w:sz w:val="24"/>
           <w:szCs w:val="24"/>
         </w:rPr>
+        <w:lastRenderedPageBreak/>
         <w:t>Pedidos</w:t>
       </w:r>
     </w:p>
@@ -9032,7 +9002,6 @@
           <w:sz w:val="24"/>
           <w:szCs w:val="24"/>
         </w:rPr>
-        <w:lastRenderedPageBreak/>
         <w:t xml:space="preserve">Classificação das anomalias: </w:t>
       </w:r>
       <w:r>
@@ -9062,6 +9031,7 @@
           <w:sz w:val="24"/>
           <w:szCs w:val="24"/>
         </w:rPr>
+        <w:lastRenderedPageBreak/>
         <w:t xml:space="preserve">Classificação das recomendações: </w:t>
       </w:r>
       <w:r>
@@ -9140,12 +9110,6 @@
         <w:gridCol w:w="3570"/>
       </w:tblGrid>
       <w:tr>
-        <w:tblPrEx>
-          <w:tblCellMar>
-            <w:top w:w="0" w:type="dxa"/>
-            <w:bottom w:w="0" w:type="dxa"/>
-          </w:tblCellMar>
-        </w:tblPrEx>
         <w:trPr>
           <w:tblHeader/>
         </w:trPr>
@@ -9232,12 +9196,6 @@
         </w:tc>
       </w:tr>
       <w:tr>
-        <w:tblPrEx>
-          <w:tblCellMar>
-            <w:top w:w="0" w:type="dxa"/>
-            <w:bottom w:w="0" w:type="dxa"/>
-          </w:tblCellMar>
-        </w:tblPrEx>
         <w:tc>
           <w:tcPr>
             <w:tcW w:w="2300" w:type="dxa"/>
@@ -9312,12 +9270,6 @@
         </w:tc>
       </w:tr>
       <w:tr>
-        <w:tblPrEx>
-          <w:tblCellMar>
-            <w:top w:w="0" w:type="dxa"/>
-            <w:bottom w:w="0" w:type="dxa"/>
-          </w:tblCellMar>
-        </w:tblPrEx>
         <w:tc>
           <w:tcPr>
             <w:tcW w:w="2300" w:type="dxa"/>
@@ -9392,12 +9344,6 @@
         </w:tc>
       </w:tr>
       <w:tr>
-        <w:tblPrEx>
-          <w:tblCellMar>
-            <w:top w:w="0" w:type="dxa"/>
-            <w:bottom w:w="0" w:type="dxa"/>
-          </w:tblCellMar>
-        </w:tblPrEx>
         <w:tc>
           <w:tcPr>
             <w:tcW w:w="2300" w:type="dxa"/>
@@ -9472,12 +9418,6 @@
         </w:tc>
       </w:tr>
       <w:tr>
-        <w:tblPrEx>
-          <w:tblCellMar>
-            <w:top w:w="0" w:type="dxa"/>
-            <w:bottom w:w="0" w:type="dxa"/>
-          </w:tblCellMar>
-        </w:tblPrEx>
         <w:tc>
           <w:tcPr>
             <w:tcW w:w="2300" w:type="dxa"/>
@@ -10062,8 +10002,15 @@
           <w:sz w:val="24"/>
           <w:szCs w:val="24"/>
         </w:rPr>
-        <w:t xml:space="preserve">. O arquivo seed.py popula o </w:t>
-      </w:r>
+        <w:t>. O arquivo seed.py popula o banco com usuários, produtos e pedidos de exemplo, o que facilita a apresentação do sistema.</w:t>
+      </w:r>
+    </w:p>
+    <w:p>
+      <w:pPr>
+        <w:spacing w:after="120" w:line="360" w:lineRule="auto"/>
+        <w:ind w:firstLine="708"/>
+        <w:jc w:val="both"/>
+      </w:pPr>
       <w:r>
         <w:rPr>
           <w:rFonts w:ascii="Arial" w:eastAsia="Arial" w:hAnsi="Arial" w:cs="Arial"/>
@@ -10071,21 +10018,6 @@
           <w:szCs w:val="24"/>
         </w:rPr>
         <w:lastRenderedPageBreak/>
-        <w:t>banco com usuários, produtos e pedidos de exemplo, o que facilita a apresentação do sistema.</w:t>
-      </w:r>
-    </w:p>
-    <w:p>
-      <w:pPr>
-        <w:spacing w:after="120" w:line="360" w:lineRule="auto"/>
-        <w:ind w:firstLine="708"/>
-        <w:jc w:val="both"/>
-      </w:pPr>
-      <w:r>
-        <w:rPr>
-          <w:rFonts w:ascii="Arial" w:eastAsia="Arial" w:hAnsi="Arial" w:cs="Arial"/>
-          <w:sz w:val="24"/>
-          <w:szCs w:val="24"/>
-        </w:rPr>
         <w:t xml:space="preserve">Depois disso, o sistema pode ser acessado pelo endereço http://127.0.0.1:8000/. Os usuários de exemplo criados pelo </w:t>
       </w:r>
       <w:proofErr w:type="spellStart"/>
@@ -10130,12 +10062,6 @@
         <w:gridCol w:w="4670"/>
       </w:tblGrid>
       <w:tr>
-        <w:tblPrEx>
-          <w:tblCellMar>
-            <w:top w:w="0" w:type="dxa"/>
-            <w:bottom w:w="0" w:type="dxa"/>
-          </w:tblCellMar>
-        </w:tblPrEx>
         <w:trPr>
           <w:tblHeader/>
         </w:trPr>
@@ -10222,12 +10148,6 @@
         </w:tc>
       </w:tr>
       <w:tr>
-        <w:tblPrEx>
-          <w:tblCellMar>
-            <w:top w:w="0" w:type="dxa"/>
-            <w:bottom w:w="0" w:type="dxa"/>
-          </w:tblCellMar>
-        </w:tblPrEx>
         <w:tc>
           <w:tcPr>
             <w:tcW w:w="2000" w:type="dxa"/>
@@ -10302,12 +10222,6 @@
         </w:tc>
       </w:tr>
       <w:tr>
-        <w:tblPrEx>
-          <w:tblCellMar>
-            <w:top w:w="0" w:type="dxa"/>
-            <w:bottom w:w="0" w:type="dxa"/>
-          </w:tblCellMar>
-        </w:tblPrEx>
         <w:tc>
           <w:tcPr>
             <w:tcW w:w="2000" w:type="dxa"/>

</xml_diff>